<commit_message>
feat: display "特別休假" change to "特休" hiding "下載報表" at "出勤管理" tab when user is not hr or admin fix docx template issue
</commit_message>
<xml_diff>
--- a/frontend/public/templates/businessTripRequest.docx
+++ b/frontend/public/templates/businessTripRequest.docx
@@ -25,9 +25,9 @@
         <w:gridCol w:w="1036"/>
         <w:gridCol w:w="2268"/>
         <w:gridCol w:w="992"/>
-        <w:gridCol w:w="2192"/>
-        <w:gridCol w:w="175"/>
-        <w:gridCol w:w="893"/>
+        <w:gridCol w:w="2367"/>
+        <w:gridCol w:w="140"/>
+        <w:gridCol w:w="753"/>
         <w:gridCol w:w="2367"/>
       </w:tblGrid>
       <w:tr>
@@ -37,8 +37,8 @@
         </w:trPr>
         <w:tc>
           <w:tcPr>
-            <w:tcW w:w="6488" w:type="dxa"/>
-            <w:gridSpan w:val="4"/>
+            <w:tcW w:w="6803" w:type="dxa"/>
+            <w:gridSpan w:val="5"/>
             <w:tcBorders>
               <w:top w:val="single" w:sz="12" w:space="0" w:color="auto"/>
               <w:bottom w:val="single" w:sz="6" w:space="0" w:color="auto"/>
@@ -60,28 +60,23 @@
                 <w:rFonts w:ascii="標楷體" w:eastAsia="標楷體" w:hAnsi="標楷體" w:hint="eastAsia"/>
                 <w:sz w:val="56"/>
               </w:rPr>
-              <w:t>臺龍電子員工</w:t>
+              <w:t>臺龍電子因公免刷卡</w:t>
             </w:r>
             <w:r>
               <w:rPr>
                 <w:rFonts w:ascii="標楷體" w:eastAsia="標楷體" w:hAnsi="標楷體" w:hint="eastAsia"/>
                 <w:sz w:val="56"/>
               </w:rPr>
-              <w:t>出差</w:t>
-            </w:r>
-            <w:r>
-              <w:rPr>
-                <w:rFonts w:ascii="標楷體" w:eastAsia="標楷體" w:hAnsi="標楷體" w:hint="eastAsia"/>
-                <w:sz w:val="56"/>
-              </w:rPr>
               <w:t>單</w:t>
             </w:r>
-          </w:p>
-        </w:tc>
-        <w:tc>
-          <w:tcPr>
-            <w:tcW w:w="3435" w:type="dxa"/>
-            <w:gridSpan w:val="3"/>
+            <w:bookmarkStart w:id="0" w:name="_GoBack"/>
+            <w:bookmarkEnd w:id="0"/>
+          </w:p>
+        </w:tc>
+        <w:tc>
+          <w:tcPr>
+            <w:tcW w:w="3120" w:type="dxa"/>
+            <w:gridSpan w:val="2"/>
             <w:tcBorders>
               <w:top w:val="single" w:sz="12" w:space="0" w:color="auto"/>
               <w:left w:val="nil"/>
@@ -243,7 +238,6 @@
         <w:tc>
           <w:tcPr>
             <w:tcW w:w="2367" w:type="dxa"/>
-            <w:gridSpan w:val="2"/>
             <w:tcBorders>
               <w:top w:val="nil"/>
             </w:tcBorders>
@@ -273,6 +267,7 @@
         <w:tc>
           <w:tcPr>
             <w:tcW w:w="893" w:type="dxa"/>
+            <w:gridSpan w:val="2"/>
             <w:tcBorders>
               <w:top w:val="nil"/>
             </w:tcBorders>
@@ -486,8 +481,6 @@
               </w:rPr>
               <w:br/>
             </w:r>
-            <w:bookmarkStart w:id="0" w:name="_GoBack"/>
-            <w:bookmarkEnd w:id="0"/>
             <w:r>
               <w:rPr>
                 <w:rFonts w:ascii="標楷體" w:eastAsia="標楷體" w:hAnsi="標楷體"/>
@@ -651,24 +644,24 @@
         <w:tc>
           <w:tcPr>
             <w:tcW w:w="2367" w:type="dxa"/>
+            <w:vAlign w:val="center"/>
+          </w:tcPr>
+          <w:p>
+            <w:pPr>
+              <w:rPr>
+                <w:rFonts w:ascii="標楷體" w:eastAsia="標楷體" w:hAnsi="標楷體"/>
+              </w:rPr>
+            </w:pPr>
+          </w:p>
+        </w:tc>
+        <w:tc>
+          <w:tcPr>
+            <w:tcW w:w="893" w:type="dxa"/>
             <w:gridSpan w:val="2"/>
             <w:vAlign w:val="center"/>
           </w:tcPr>
           <w:p>
             <w:pPr>
-              <w:rPr>
-                <w:rFonts w:ascii="標楷體" w:eastAsia="標楷體" w:hAnsi="標楷體"/>
-              </w:rPr>
-            </w:pPr>
-          </w:p>
-        </w:tc>
-        <w:tc>
-          <w:tcPr>
-            <w:tcW w:w="893" w:type="dxa"/>
-            <w:vAlign w:val="center"/>
-          </w:tcPr>
-          <w:p>
-            <w:pPr>
               <w:jc w:val="distribute"/>
               <w:rPr>
                 <w:rFonts w:ascii="標楷體" w:eastAsia="標楷體" w:hAnsi="標楷體"/>
@@ -678,7 +671,7 @@
               <w:rPr>
                 <w:rFonts w:ascii="標楷體" w:eastAsia="標楷體" w:hAnsi="標楷體" w:hint="eastAsia"/>
               </w:rPr>
-              <w:t>管理部</w:t>
+              <w:t>人事</w:t>
             </w:r>
           </w:p>
         </w:tc>

</xml_diff>